<commit_message>
szakdolgozat vedes ppt 1.0
</commit_message>
<xml_diff>
--- a/szakdoga/pszeudokod_OnlineKMeans.docx
+++ b/szakdoga/pszeudokod_OnlineKMeans.docx
@@ -22,7 +22,7 @@
           </w:tcPr>
           <w:p>
             <w:pPr>
-              <w:spacing w:before="60" w:after="60"/>
+              <w:spacing w:before="60" w:after="60" w:line="276" w:lineRule="auto"/>
               <w:rPr>
                 <w:rFonts w:asciiTheme="majorBidi" w:hAnsiTheme="majorBidi" w:cstheme="majorBidi"/>
               </w:rPr>
@@ -31,16 +31,8 @@
               <w:rPr>
                 <w:rFonts w:asciiTheme="majorBidi" w:hAnsiTheme="majorBidi" w:cstheme="majorBidi"/>
               </w:rPr>
-              <w:t xml:space="preserve">Algoritmus 3.1.: Online </w:t>
-            </w:r>
-            <w:proofErr w:type="spellStart"/>
-            <w:r>
-              <w:rPr>
-                <w:rFonts w:asciiTheme="majorBidi" w:hAnsiTheme="majorBidi" w:cstheme="majorBidi"/>
-              </w:rPr>
-              <w:t>KMeans</w:t>
-            </w:r>
-            <w:proofErr w:type="spellEnd"/>
+              <w:t>Algoritmus: Online KMeans</w:t>
+            </w:r>
           </w:p>
         </w:tc>
       </w:tr>
@@ -55,6 +47,7 @@
           </w:tcPr>
           <w:p>
             <w:pPr>
+              <w:spacing w:before="120"/>
               <w:rPr>
                 <w:rFonts w:asciiTheme="majorBidi" w:hAnsiTheme="majorBidi" w:cstheme="majorBidi"/>
               </w:rPr>
@@ -89,7 +82,6 @@
               </w:rPr>
               <w:t xml:space="preserve"> </w:t>
             </w:r>
-            <w:proofErr w:type="spellStart"/>
             <w:r>
               <w:rPr>
                 <w:rFonts w:asciiTheme="majorBidi" w:hAnsiTheme="majorBidi" w:cstheme="majorBidi"/>
@@ -98,7 +90,6 @@
               </w:rPr>
               <w:t>batch_adat</w:t>
             </w:r>
-            <w:proofErr w:type="spellEnd"/>
           </w:p>
           <w:p>
             <w:pPr>
@@ -124,66 +115,26 @@
               </w:rPr>
               <w:t xml:space="preserve">        </w:t>
             </w:r>
-            <w:proofErr w:type="spellStart"/>
             <w:r>
               <w:rPr>
                 <w:rFonts w:asciiTheme="majorBidi" w:hAnsiTheme="majorBidi" w:cstheme="majorBidi"/>
               </w:rPr>
               <w:t>if</w:t>
             </w:r>
-            <w:proofErr w:type="spellEnd"/>
-            <w:r>
-              <w:rPr>
-                <w:rFonts w:asciiTheme="majorBidi" w:hAnsiTheme="majorBidi" w:cstheme="majorBidi"/>
-                <w:b w:val="0"/>
-                <w:bCs w:val="0"/>
-              </w:rPr>
-              <w:t xml:space="preserve"> </w:t>
-            </w:r>
-            <w:proofErr w:type="spellStart"/>
-            <w:r>
-              <w:rPr>
-                <w:rFonts w:asciiTheme="majorBidi" w:hAnsiTheme="majorBidi" w:cstheme="majorBidi"/>
-                <w:b w:val="0"/>
-                <w:bCs w:val="0"/>
-              </w:rPr>
-              <w:t>centroids</w:t>
-            </w:r>
-            <w:proofErr w:type="spellEnd"/>
-            <w:r>
-              <w:rPr>
-                <w:rFonts w:asciiTheme="majorBidi" w:hAnsiTheme="majorBidi" w:cstheme="majorBidi"/>
-                <w:b w:val="0"/>
-                <w:bCs w:val="0"/>
-              </w:rPr>
-              <w:t xml:space="preserve"> is </w:t>
-            </w:r>
-            <w:proofErr w:type="spellStart"/>
-            <w:r>
-              <w:rPr>
-                <w:rFonts w:asciiTheme="majorBidi" w:hAnsiTheme="majorBidi" w:cstheme="majorBidi"/>
-                <w:b w:val="0"/>
-                <w:bCs w:val="0"/>
-              </w:rPr>
-              <w:t>None</w:t>
-            </w:r>
-            <w:proofErr w:type="spellEnd"/>
-            <w:r>
-              <w:rPr>
-                <w:rFonts w:asciiTheme="majorBidi" w:hAnsiTheme="majorBidi" w:cstheme="majorBidi"/>
-                <w:b w:val="0"/>
-                <w:bCs w:val="0"/>
-              </w:rPr>
-              <w:t xml:space="preserve"> </w:t>
-            </w:r>
-            <w:proofErr w:type="spellStart"/>
+            <w:r>
+              <w:rPr>
+                <w:rFonts w:asciiTheme="majorBidi" w:hAnsiTheme="majorBidi" w:cstheme="majorBidi"/>
+                <w:b w:val="0"/>
+                <w:bCs w:val="0"/>
+              </w:rPr>
+              <w:t xml:space="preserve"> centroids is None </w:t>
+            </w:r>
             <w:r>
               <w:rPr>
                 <w:rFonts w:asciiTheme="majorBidi" w:hAnsiTheme="majorBidi" w:cstheme="majorBidi"/>
               </w:rPr>
               <w:t>then</w:t>
             </w:r>
-            <w:proofErr w:type="spellEnd"/>
           </w:p>
           <w:p>
             <w:pPr>
@@ -207,55 +158,19 @@
               </w:rPr>
               <w:t xml:space="preserve">                </w:t>
             </w:r>
-            <w:proofErr w:type="spellStart"/>
-            <w:r>
-              <w:rPr>
-                <w:rFonts w:asciiTheme="majorBidi" w:hAnsiTheme="majorBidi" w:cstheme="majorBidi"/>
-              </w:rPr>
-              <w:t>function</w:t>
-            </w:r>
-            <w:proofErr w:type="spellEnd"/>
-            <w:r>
-              <w:rPr>
-                <w:rFonts w:asciiTheme="majorBidi" w:hAnsiTheme="majorBidi" w:cstheme="majorBidi"/>
-              </w:rPr>
-              <w:t xml:space="preserve"> </w:t>
-            </w:r>
-            <w:proofErr w:type="spellStart"/>
-            <w:r>
-              <w:rPr>
-                <w:rFonts w:asciiTheme="majorBidi" w:hAnsiTheme="majorBidi" w:cstheme="majorBidi"/>
-                <w:b w:val="0"/>
-                <w:bCs w:val="0"/>
-              </w:rPr>
-              <w:t>initialize_centroids</w:t>
-            </w:r>
-            <w:proofErr w:type="spellEnd"/>
-            <w:r>
-              <w:rPr>
-                <w:rFonts w:asciiTheme="majorBidi" w:hAnsiTheme="majorBidi" w:cstheme="majorBidi"/>
-                <w:b w:val="0"/>
-                <w:bCs w:val="0"/>
-              </w:rPr>
-              <w:t>(</w:t>
-            </w:r>
-            <w:proofErr w:type="spellStart"/>
-            <w:r>
-              <w:rPr>
-                <w:rFonts w:asciiTheme="majorBidi" w:hAnsiTheme="majorBidi" w:cstheme="majorBidi"/>
-                <w:b w:val="0"/>
-                <w:bCs w:val="0"/>
-              </w:rPr>
-              <w:t>batch_adat</w:t>
-            </w:r>
-            <w:proofErr w:type="spellEnd"/>
-            <w:r>
-              <w:rPr>
-                <w:rFonts w:asciiTheme="majorBidi" w:hAnsiTheme="majorBidi" w:cstheme="majorBidi"/>
-                <w:b w:val="0"/>
-                <w:bCs w:val="0"/>
-              </w:rPr>
-              <w:t>)</w:t>
+            <w:r>
+              <w:rPr>
+                <w:rFonts w:asciiTheme="majorBidi" w:hAnsiTheme="majorBidi" w:cstheme="majorBidi"/>
+              </w:rPr>
+              <w:t xml:space="preserve">function </w:t>
+            </w:r>
+            <w:r>
+              <w:rPr>
+                <w:rFonts w:asciiTheme="majorBidi" w:hAnsiTheme="majorBidi" w:cstheme="majorBidi"/>
+                <w:b w:val="0"/>
+                <w:bCs w:val="0"/>
+              </w:rPr>
+              <w:t>initialize_centroids(batch_adat)</w:t>
             </w:r>
           </w:p>
           <w:p>
@@ -284,16 +199,8 @@
               <w:rPr>
                 <w:rFonts w:asciiTheme="majorBidi" w:hAnsiTheme="majorBidi" w:cstheme="majorBidi"/>
               </w:rPr>
-              <w:t xml:space="preserve">end </w:t>
-            </w:r>
-            <w:proofErr w:type="spellStart"/>
-            <w:r>
-              <w:rPr>
-                <w:rFonts w:asciiTheme="majorBidi" w:hAnsiTheme="majorBidi" w:cstheme="majorBidi"/>
-              </w:rPr>
-              <w:t>if</w:t>
-            </w:r>
-            <w:proofErr w:type="spellEnd"/>
+              <w:t>end if</w:t>
+            </w:r>
           </w:p>
           <w:p>
             <w:pPr>
@@ -325,103 +232,21 @@
                 <w:b w:val="0"/>
                 <w:bCs w:val="0"/>
               </w:rPr>
-              <w:t xml:space="preserve">D </w:t>
-            </w:r>
-            <w:r>
-              <w:rPr>
-                <w:rFonts w:asciiTheme="majorBidi" w:hAnsiTheme="majorBidi" w:cstheme="majorBidi"/>
-                <w:b w:val="0"/>
-                <w:bCs w:val="0"/>
-              </w:rPr>
-              <w:t>←</w:t>
-            </w:r>
-            <w:r>
-              <w:rPr>
-                <w:rFonts w:asciiTheme="majorBidi" w:hAnsiTheme="majorBidi" w:cstheme="majorBidi"/>
-                <w:b w:val="0"/>
-                <w:bCs w:val="0"/>
-              </w:rPr>
-              <w:t xml:space="preserve"> </w:t>
-            </w:r>
-            <w:proofErr w:type="spellStart"/>
+              <w:t xml:space="preserve">D ← </w:t>
+            </w:r>
             <w:r>
               <w:rPr>
                 <w:rFonts w:asciiTheme="majorBidi" w:hAnsiTheme="majorBidi" w:cstheme="majorBidi"/>
               </w:rPr>
               <w:t>function</w:t>
             </w:r>
-            <w:proofErr w:type="spellEnd"/>
-            <w:r>
-              <w:rPr>
-                <w:rFonts w:asciiTheme="majorBidi" w:hAnsiTheme="majorBidi" w:cstheme="majorBidi"/>
-                <w:b w:val="0"/>
-                <w:bCs w:val="0"/>
-              </w:rPr>
-              <w:t xml:space="preserve"> _</w:t>
-            </w:r>
-            <w:proofErr w:type="spellStart"/>
-            <w:r>
-              <w:rPr>
-                <w:rFonts w:asciiTheme="majorBidi" w:hAnsiTheme="majorBidi" w:cstheme="majorBidi"/>
-                <w:b w:val="0"/>
-                <w:bCs w:val="0"/>
-              </w:rPr>
-              <w:t>pairwise_</w:t>
-            </w:r>
-            <w:proofErr w:type="gramStart"/>
-            <w:r>
-              <w:rPr>
-                <w:rFonts w:asciiTheme="majorBidi" w:hAnsiTheme="majorBidi" w:cstheme="majorBidi"/>
-                <w:b w:val="0"/>
-                <w:bCs w:val="0"/>
-              </w:rPr>
-              <w:t>dist</w:t>
-            </w:r>
-            <w:proofErr w:type="spellEnd"/>
-            <w:r>
-              <w:rPr>
-                <w:rFonts w:asciiTheme="majorBidi" w:hAnsiTheme="majorBidi" w:cstheme="majorBidi"/>
-                <w:b w:val="0"/>
-                <w:bCs w:val="0"/>
-              </w:rPr>
-              <w:t>(</w:t>
-            </w:r>
-            <w:proofErr w:type="spellStart"/>
-            <w:proofErr w:type="gramEnd"/>
-            <w:r>
-              <w:rPr>
-                <w:rFonts w:asciiTheme="majorBidi" w:hAnsiTheme="majorBidi" w:cstheme="majorBidi"/>
-                <w:b w:val="0"/>
-                <w:bCs w:val="0"/>
-              </w:rPr>
-              <w:t>batch_adat</w:t>
-            </w:r>
-            <w:proofErr w:type="spellEnd"/>
-            <w:r>
-              <w:rPr>
-                <w:rFonts w:asciiTheme="majorBidi" w:hAnsiTheme="majorBidi" w:cstheme="majorBidi"/>
-                <w:b w:val="0"/>
-                <w:bCs w:val="0"/>
-              </w:rPr>
-              <w:t xml:space="preserve">, </w:t>
-            </w:r>
-            <w:proofErr w:type="spellStart"/>
-            <w:r>
-              <w:rPr>
-                <w:rFonts w:asciiTheme="majorBidi" w:hAnsiTheme="majorBidi" w:cstheme="majorBidi"/>
-                <w:b w:val="0"/>
-                <w:bCs w:val="0"/>
-              </w:rPr>
-              <w:t>centroids</w:t>
-            </w:r>
-            <w:proofErr w:type="spellEnd"/>
-            <w:r>
-              <w:rPr>
-                <w:rFonts w:asciiTheme="majorBidi" w:hAnsiTheme="majorBidi" w:cstheme="majorBidi"/>
-                <w:b w:val="0"/>
-                <w:bCs w:val="0"/>
-              </w:rPr>
-              <w:t>)</w:t>
+            <w:r>
+              <w:rPr>
+                <w:rFonts w:asciiTheme="majorBidi" w:hAnsiTheme="majorBidi" w:cstheme="majorBidi"/>
+                <w:b w:val="0"/>
+                <w:bCs w:val="0"/>
+              </w:rPr>
+              <w:t xml:space="preserve"> _pairwise_dist(batch_adat, centroids)</w:t>
             </w:r>
           </w:p>
           <w:p>
@@ -446,75 +271,13 @@
               </w:rPr>
               <w:t xml:space="preserve">        </w:t>
             </w:r>
-            <w:proofErr w:type="spellStart"/>
-            <w:r>
-              <w:rPr>
-                <w:rFonts w:asciiTheme="majorBidi" w:hAnsiTheme="majorBidi" w:cstheme="majorBidi"/>
-                <w:b w:val="0"/>
-                <w:bCs w:val="0"/>
-              </w:rPr>
-              <w:t>min_dist</w:t>
-            </w:r>
-            <w:proofErr w:type="spellEnd"/>
-            <w:r>
-              <w:rPr>
-                <w:rFonts w:asciiTheme="majorBidi" w:hAnsiTheme="majorBidi" w:cstheme="majorBidi"/>
-                <w:b w:val="0"/>
-                <w:bCs w:val="0"/>
-              </w:rPr>
-              <w:t xml:space="preserve"> </w:t>
-            </w:r>
-            <w:r>
-              <w:rPr>
-                <w:rFonts w:asciiTheme="majorBidi" w:hAnsiTheme="majorBidi" w:cstheme="majorBidi"/>
-                <w:b w:val="0"/>
-                <w:bCs w:val="0"/>
-              </w:rPr>
-              <w:t>←</w:t>
-            </w:r>
-            <w:r>
-              <w:rPr>
-                <w:rFonts w:asciiTheme="majorBidi" w:hAnsiTheme="majorBidi" w:cstheme="majorBidi"/>
-                <w:b w:val="0"/>
-                <w:bCs w:val="0"/>
-              </w:rPr>
-              <w:t xml:space="preserve"> </w:t>
-            </w:r>
-            <w:proofErr w:type="spellStart"/>
-            <w:r>
-              <w:rPr>
-                <w:rFonts w:asciiTheme="majorBidi" w:hAnsiTheme="majorBidi" w:cstheme="majorBidi"/>
-                <w:b w:val="0"/>
-                <w:bCs w:val="0"/>
-              </w:rPr>
-              <w:t>D.min</w:t>
-            </w:r>
-            <w:proofErr w:type="spellEnd"/>
-            <w:r>
-              <w:rPr>
-                <w:rFonts w:asciiTheme="majorBidi" w:hAnsiTheme="majorBidi" w:cstheme="majorBidi"/>
-                <w:b w:val="0"/>
-                <w:bCs w:val="0"/>
-              </w:rPr>
-              <w:t>(</w:t>
-            </w:r>
-            <w:proofErr w:type="spellStart"/>
-            <w:r>
-              <w:rPr>
-                <w:rFonts w:asciiTheme="majorBidi" w:hAnsiTheme="majorBidi" w:cstheme="majorBidi"/>
-                <w:b w:val="0"/>
-                <w:bCs w:val="0"/>
-              </w:rPr>
-              <w:t>axis</w:t>
-            </w:r>
-            <w:proofErr w:type="spellEnd"/>
-            <w:r>
-              <w:rPr>
-                <w:rFonts w:asciiTheme="majorBidi" w:hAnsiTheme="majorBidi" w:cstheme="majorBidi"/>
-                <w:b w:val="0"/>
-                <w:bCs w:val="0"/>
-              </w:rPr>
-              <w:t>=1)</w:t>
+            <w:r>
+              <w:rPr>
+                <w:rFonts w:asciiTheme="majorBidi" w:hAnsiTheme="majorBidi" w:cstheme="majorBidi"/>
+                <w:b w:val="0"/>
+                <w:bCs w:val="0"/>
+              </w:rPr>
+              <w:t>min_dist ← D.min(axis=1)</w:t>
             </w:r>
           </w:p>
           <w:p>
@@ -539,77 +302,13 @@
               </w:rPr>
               <w:t xml:space="preserve">        </w:t>
             </w:r>
-            <w:proofErr w:type="spellStart"/>
-            <w:r>
-              <w:rPr>
-                <w:rFonts w:asciiTheme="majorBidi" w:hAnsiTheme="majorBidi" w:cstheme="majorBidi"/>
-                <w:b w:val="0"/>
-                <w:bCs w:val="0"/>
-              </w:rPr>
-              <w:t>labels</w:t>
-            </w:r>
-            <w:proofErr w:type="spellEnd"/>
-            <w:r>
-              <w:rPr>
-                <w:rFonts w:asciiTheme="majorBidi" w:hAnsiTheme="majorBidi" w:cstheme="majorBidi"/>
-                <w:b w:val="0"/>
-                <w:bCs w:val="0"/>
-              </w:rPr>
-              <w:t xml:space="preserve"> </w:t>
-            </w:r>
-            <w:r>
-              <w:rPr>
-                <w:rFonts w:asciiTheme="majorBidi" w:hAnsiTheme="majorBidi" w:cstheme="majorBidi"/>
-                <w:b w:val="0"/>
-                <w:bCs w:val="0"/>
-              </w:rPr>
-              <w:t>←</w:t>
-            </w:r>
-            <w:r>
-              <w:rPr>
-                <w:rFonts w:asciiTheme="majorBidi" w:hAnsiTheme="majorBidi" w:cstheme="majorBidi"/>
-                <w:b w:val="0"/>
-                <w:bCs w:val="0"/>
-              </w:rPr>
-              <w:t xml:space="preserve"> </w:t>
-            </w:r>
-            <w:proofErr w:type="spellStart"/>
-            <w:proofErr w:type="gramStart"/>
-            <w:r>
-              <w:rPr>
-                <w:rFonts w:asciiTheme="majorBidi" w:hAnsiTheme="majorBidi" w:cstheme="majorBidi"/>
-                <w:b w:val="0"/>
-                <w:bCs w:val="0"/>
-              </w:rPr>
-              <w:t>D.argmin</w:t>
-            </w:r>
-            <w:proofErr w:type="spellEnd"/>
-            <w:proofErr w:type="gramEnd"/>
-            <w:r>
-              <w:rPr>
-                <w:rFonts w:asciiTheme="majorBidi" w:hAnsiTheme="majorBidi" w:cstheme="majorBidi"/>
-                <w:b w:val="0"/>
-                <w:bCs w:val="0"/>
-              </w:rPr>
-              <w:t>(</w:t>
-            </w:r>
-            <w:proofErr w:type="spellStart"/>
-            <w:r>
-              <w:rPr>
-                <w:rFonts w:asciiTheme="majorBidi" w:hAnsiTheme="majorBidi" w:cstheme="majorBidi"/>
-                <w:b w:val="0"/>
-                <w:bCs w:val="0"/>
-              </w:rPr>
-              <w:t>axis</w:t>
-            </w:r>
-            <w:proofErr w:type="spellEnd"/>
-            <w:r>
-              <w:rPr>
-                <w:rFonts w:asciiTheme="majorBidi" w:hAnsiTheme="majorBidi" w:cstheme="majorBidi"/>
-                <w:b w:val="0"/>
-                <w:bCs w:val="0"/>
-              </w:rPr>
-              <w:t>=1)</w:t>
+            <w:r>
+              <w:rPr>
+                <w:rFonts w:asciiTheme="majorBidi" w:hAnsiTheme="majorBidi" w:cstheme="majorBidi"/>
+                <w:b w:val="0"/>
+                <w:bCs w:val="0"/>
+              </w:rPr>
+              <w:t>labels ← D.argmin(axis=1)</w:t>
             </w:r>
           </w:p>
           <w:p>
@@ -634,14 +333,20 @@
               </w:rPr>
               <w:t xml:space="preserve">        </w:t>
             </w:r>
-            <w:proofErr w:type="spellStart"/>
             <w:r>
               <w:rPr>
                 <w:rFonts w:asciiTheme="majorBidi" w:hAnsiTheme="majorBidi" w:cstheme="majorBidi"/>
               </w:rPr>
               <w:t>if</w:t>
             </w:r>
-            <w:proofErr w:type="spellEnd"/>
+            <w:r>
+              <w:rPr>
+                <w:rFonts w:asciiTheme="majorBidi" w:hAnsiTheme="majorBidi" w:cstheme="majorBidi"/>
+                <w:b w:val="0"/>
+                <w:bCs w:val="0"/>
+              </w:rPr>
+              <w:t xml:space="preserve"> new_cluster_threshold is not None and length(centroids) &lt;</w:t>
+            </w:r>
             <w:r>
               <w:rPr>
                 <w:rFonts w:asciiTheme="majorBidi" w:hAnsiTheme="majorBidi" w:cstheme="majorBidi"/>
@@ -650,34 +355,14 @@
               </w:rPr>
               <w:t xml:space="preserve"> </w:t>
             </w:r>
-            <w:proofErr w:type="spellStart"/>
-            <w:r>
-              <w:rPr>
-                <w:rFonts w:asciiTheme="majorBidi" w:hAnsiTheme="majorBidi" w:cstheme="majorBidi"/>
-                <w:b w:val="0"/>
-                <w:bCs w:val="0"/>
-              </w:rPr>
-              <w:t>new_cluster_threshold</w:t>
-            </w:r>
-            <w:proofErr w:type="spellEnd"/>
-            <w:r>
-              <w:rPr>
-                <w:rFonts w:asciiTheme="majorBidi" w:hAnsiTheme="majorBidi" w:cstheme="majorBidi"/>
-                <w:b w:val="0"/>
-                <w:bCs w:val="0"/>
-              </w:rPr>
-              <w:t xml:space="preserve"> is </w:t>
-            </w:r>
-            <w:proofErr w:type="spellStart"/>
-            <w:r>
-              <w:rPr>
-                <w:rFonts w:asciiTheme="majorBidi" w:hAnsiTheme="majorBidi" w:cstheme="majorBidi"/>
-                <w:b w:val="0"/>
-                <w:bCs w:val="0"/>
-              </w:rPr>
-              <w:t>not</w:t>
-            </w:r>
-            <w:proofErr w:type="spellEnd"/>
+            <w:r>
+              <w:rPr>
+                <w:rFonts w:asciiTheme="majorBidi" w:hAnsiTheme="majorBidi" w:cstheme="majorBidi"/>
+                <w:b w:val="0"/>
+                <w:bCs w:val="0"/>
+              </w:rPr>
+              <w:t>max_clusters</w:t>
+            </w:r>
             <w:r>
               <w:rPr>
                 <w:rFonts w:asciiTheme="majorBidi" w:hAnsiTheme="majorBidi" w:cstheme="majorBidi"/>
@@ -686,112 +371,12 @@
               </w:rPr>
               <w:t xml:space="preserve"> </w:t>
             </w:r>
-            <w:proofErr w:type="spellStart"/>
-            <w:r>
-              <w:rPr>
-                <w:rFonts w:asciiTheme="majorBidi" w:hAnsiTheme="majorBidi" w:cstheme="majorBidi"/>
-                <w:b w:val="0"/>
-                <w:bCs w:val="0"/>
-              </w:rPr>
-              <w:t>None</w:t>
-            </w:r>
-            <w:proofErr w:type="spellEnd"/>
-            <w:r>
-              <w:rPr>
-                <w:rFonts w:asciiTheme="majorBidi" w:hAnsiTheme="majorBidi" w:cstheme="majorBidi"/>
-                <w:b w:val="0"/>
-                <w:bCs w:val="0"/>
-              </w:rPr>
-              <w:t xml:space="preserve"> and </w:t>
-            </w:r>
-            <w:proofErr w:type="spellStart"/>
-            <w:r>
-              <w:rPr>
-                <w:rFonts w:asciiTheme="majorBidi" w:hAnsiTheme="majorBidi" w:cstheme="majorBidi"/>
-                <w:b w:val="0"/>
-                <w:bCs w:val="0"/>
-              </w:rPr>
-              <w:t>length</w:t>
-            </w:r>
-            <w:proofErr w:type="spellEnd"/>
-            <w:r>
-              <w:rPr>
-                <w:rFonts w:asciiTheme="majorBidi" w:hAnsiTheme="majorBidi" w:cstheme="majorBidi"/>
-                <w:b w:val="0"/>
-                <w:bCs w:val="0"/>
-              </w:rPr>
-              <w:t>(</w:t>
-            </w:r>
-            <w:proofErr w:type="spellStart"/>
-            <w:r>
-              <w:rPr>
-                <w:rFonts w:asciiTheme="majorBidi" w:hAnsiTheme="majorBidi" w:cstheme="majorBidi"/>
-                <w:b w:val="0"/>
-                <w:bCs w:val="0"/>
-              </w:rPr>
-              <w:t>centroids</w:t>
-            </w:r>
-            <w:proofErr w:type="spellEnd"/>
-            <w:r>
-              <w:rPr>
-                <w:rFonts w:asciiTheme="majorBidi" w:hAnsiTheme="majorBidi" w:cstheme="majorBidi"/>
-                <w:b w:val="0"/>
-                <w:bCs w:val="0"/>
-              </w:rPr>
-              <w:t xml:space="preserve">) </w:t>
-            </w:r>
-            <w:proofErr w:type="gramStart"/>
-            <w:r>
-              <w:rPr>
-                <w:rFonts w:asciiTheme="majorBidi" w:hAnsiTheme="majorBidi" w:cstheme="majorBidi"/>
-                <w:b w:val="0"/>
-                <w:bCs w:val="0"/>
-              </w:rPr>
-              <w:t>&lt;</w:t>
-            </w:r>
-            <w:r>
-              <w:rPr>
-                <w:rFonts w:asciiTheme="majorBidi" w:hAnsiTheme="majorBidi" w:cstheme="majorBidi"/>
-                <w:b w:val="0"/>
-                <w:bCs w:val="0"/>
-              </w:rPr>
-              <w:t xml:space="preserve"> </w:t>
-            </w:r>
-            <w:proofErr w:type="spellStart"/>
-            <w:r>
-              <w:rPr>
-                <w:rFonts w:asciiTheme="majorBidi" w:hAnsiTheme="majorBidi" w:cstheme="majorBidi"/>
-                <w:b w:val="0"/>
-                <w:bCs w:val="0"/>
-              </w:rPr>
-              <w:t>max</w:t>
-            </w:r>
-            <w:proofErr w:type="gramEnd"/>
-            <w:r>
-              <w:rPr>
-                <w:rFonts w:asciiTheme="majorBidi" w:hAnsiTheme="majorBidi" w:cstheme="majorBidi"/>
-                <w:b w:val="0"/>
-                <w:bCs w:val="0"/>
-              </w:rPr>
-              <w:t>_clusters</w:t>
-            </w:r>
-            <w:proofErr w:type="spellEnd"/>
-            <w:r>
-              <w:rPr>
-                <w:rFonts w:asciiTheme="majorBidi" w:hAnsiTheme="majorBidi" w:cstheme="majorBidi"/>
-                <w:b w:val="0"/>
-                <w:bCs w:val="0"/>
-              </w:rPr>
-              <w:t xml:space="preserve"> </w:t>
-            </w:r>
-            <w:proofErr w:type="spellStart"/>
             <w:r>
               <w:rPr>
                 <w:rFonts w:asciiTheme="majorBidi" w:hAnsiTheme="majorBidi" w:cstheme="majorBidi"/>
               </w:rPr>
               <w:t>then</w:t>
             </w:r>
-            <w:proofErr w:type="spellEnd"/>
           </w:p>
           <w:p>
             <w:pPr>
@@ -815,68 +400,14 @@
               </w:rPr>
               <w:t xml:space="preserve">                </w:t>
             </w:r>
-            <w:proofErr w:type="spellStart"/>
-            <w:r>
-              <w:rPr>
-                <w:rFonts w:asciiTheme="majorBidi" w:hAnsiTheme="majorBidi" w:cstheme="majorBidi"/>
-                <w:b w:val="0"/>
-                <w:bCs w:val="0"/>
-              </w:rPr>
-              <w:t>far_points</w:t>
-            </w:r>
-            <w:proofErr w:type="spellEnd"/>
-            <w:r>
-              <w:rPr>
-                <w:rFonts w:asciiTheme="majorBidi" w:hAnsiTheme="majorBidi" w:cstheme="majorBidi"/>
-                <w:b w:val="0"/>
-                <w:bCs w:val="0"/>
-              </w:rPr>
-              <w:t xml:space="preserve"> </w:t>
-            </w:r>
-            <w:r>
-              <w:rPr>
-                <w:rFonts w:asciiTheme="majorBidi" w:hAnsiTheme="majorBidi" w:cstheme="majorBidi"/>
-                <w:b w:val="0"/>
-                <w:bCs w:val="0"/>
-              </w:rPr>
-              <w:t>←</w:t>
-            </w:r>
-            <w:r>
-              <w:rPr>
-                <w:rFonts w:asciiTheme="majorBidi" w:hAnsiTheme="majorBidi" w:cstheme="majorBidi"/>
-                <w:b w:val="0"/>
-                <w:bCs w:val="0"/>
-              </w:rPr>
-              <w:t xml:space="preserve"> </w:t>
-            </w:r>
-            <w:proofErr w:type="spellStart"/>
-            <w:r>
-              <w:rPr>
-                <w:rFonts w:asciiTheme="majorBidi" w:hAnsiTheme="majorBidi" w:cstheme="majorBidi"/>
-                <w:b w:val="0"/>
-                <w:bCs w:val="0"/>
-              </w:rPr>
-              <w:t>min_dist</w:t>
-            </w:r>
-            <w:proofErr w:type="spellEnd"/>
-            <w:r>
-              <w:rPr>
-                <w:rFonts w:asciiTheme="majorBidi" w:hAnsiTheme="majorBidi" w:cstheme="majorBidi"/>
-                <w:b w:val="0"/>
-                <w:bCs w:val="0"/>
-              </w:rPr>
-              <w:t xml:space="preserve"> &gt; </w:t>
-            </w:r>
-            <w:proofErr w:type="spellStart"/>
-            <w:r>
-              <w:rPr>
-                <w:rFonts w:asciiTheme="majorBidi" w:hAnsiTheme="majorBidi" w:cstheme="majorBidi"/>
-                <w:b w:val="0"/>
-                <w:bCs w:val="0"/>
-              </w:rPr>
-              <w:t>new_cluster_threshold</w:t>
-            </w:r>
-            <w:proofErr w:type="spellEnd"/>
+            <w:r>
+              <w:rPr>
+                <w:rFonts w:asciiTheme="majorBidi" w:hAnsiTheme="majorBidi" w:cstheme="majorBidi"/>
+                <w:b w:val="0"/>
+                <w:bCs w:val="0"/>
+              </w:rPr>
+              <w:t>far_points ← min_dist &gt; new_cluster_threshold</w:t>
+            </w:r>
           </w:p>
           <w:p>
             <w:pPr>
@@ -902,39 +433,31 @@
               </w:rPr>
               <w:t xml:space="preserve">              </w:t>
             </w:r>
-            <w:proofErr w:type="spellStart"/>
-            <w:r>
-              <w:rPr>
-                <w:rFonts w:asciiTheme="majorBidi" w:hAnsiTheme="majorBidi" w:cstheme="majorBidi"/>
-              </w:rPr>
-              <w:t>foreach</w:t>
-            </w:r>
-            <w:proofErr w:type="spellEnd"/>
-            <w:r>
-              <w:rPr>
-                <w:rFonts w:asciiTheme="majorBidi" w:hAnsiTheme="majorBidi" w:cstheme="majorBidi"/>
-                <w:b w:val="0"/>
-                <w:bCs w:val="0"/>
+            <w:r>
+              <w:rPr>
+                <w:rFonts w:asciiTheme="majorBidi" w:hAnsiTheme="majorBidi" w:cstheme="majorBidi"/>
+              </w:rPr>
+              <w:t>for</w:t>
+            </w:r>
+            <w:r>
+              <w:rPr>
+                <w:rFonts w:asciiTheme="majorBidi" w:hAnsiTheme="majorBidi" w:cstheme="majorBidi"/>
               </w:rPr>
               <w:t xml:space="preserve"> </w:t>
             </w:r>
-            <w:proofErr w:type="spellStart"/>
-            <w:r>
-              <w:rPr>
-                <w:rFonts w:asciiTheme="majorBidi" w:hAnsiTheme="majorBidi" w:cstheme="majorBidi"/>
-                <w:b w:val="0"/>
-                <w:bCs w:val="0"/>
-              </w:rPr>
-              <w:t>idx</w:t>
-            </w:r>
-            <w:proofErr w:type="spellEnd"/>
-            <w:r>
-              <w:rPr>
-                <w:rFonts w:asciiTheme="majorBidi" w:hAnsiTheme="majorBidi" w:cstheme="majorBidi"/>
-                <w:b w:val="0"/>
-                <w:bCs w:val="0"/>
-              </w:rPr>
-              <w:t xml:space="preserve"> </w:t>
+            <w:r>
+              <w:rPr>
+                <w:rFonts w:asciiTheme="majorBidi" w:hAnsiTheme="majorBidi" w:cstheme="majorBidi"/>
+              </w:rPr>
+              <w:t>each</w:t>
+            </w:r>
+            <w:r>
+              <w:rPr>
+                <w:rFonts w:asciiTheme="majorBidi" w:hAnsiTheme="majorBidi" w:cstheme="majorBidi"/>
+                <w:b w:val="0"/>
+                <w:bCs w:val="0"/>
+              </w:rPr>
+              <w:t xml:space="preserve"> idx </w:t>
             </w:r>
             <w:r>
               <w:rPr>
@@ -948,34 +471,14 @@
                 <w:b w:val="0"/>
                 <w:bCs w:val="0"/>
               </w:rPr>
-              <w:t xml:space="preserve"> </w:t>
-            </w:r>
-            <w:proofErr w:type="spellStart"/>
-            <w:r>
-              <w:rPr>
-                <w:rFonts w:asciiTheme="majorBidi" w:hAnsiTheme="majorBidi" w:cstheme="majorBidi"/>
-                <w:b w:val="0"/>
-                <w:bCs w:val="0"/>
-              </w:rPr>
-              <w:t>far_points</w:t>
-            </w:r>
-            <w:proofErr w:type="spellEnd"/>
-            <w:r>
-              <w:rPr>
-                <w:rFonts w:asciiTheme="majorBidi" w:hAnsiTheme="majorBidi" w:cstheme="majorBidi"/>
-                <w:b w:val="0"/>
-                <w:bCs w:val="0"/>
-              </w:rPr>
-              <w:t xml:space="preserve"> </w:t>
-            </w:r>
-            <w:proofErr w:type="spellStart"/>
+              <w:t xml:space="preserve"> far_points </w:t>
+            </w:r>
             <w:r>
               <w:rPr>
                 <w:rFonts w:asciiTheme="majorBidi" w:hAnsiTheme="majorBidi" w:cstheme="majorBidi"/>
               </w:rPr>
               <w:t>do</w:t>
             </w:r>
-            <w:proofErr w:type="spellEnd"/>
           </w:p>
           <w:p>
             <w:pPr>
@@ -1007,75 +510,13 @@
               </w:rPr>
               <w:t xml:space="preserve">  </w:t>
             </w:r>
-            <w:proofErr w:type="spellStart"/>
-            <w:r>
-              <w:rPr>
-                <w:rFonts w:asciiTheme="majorBidi" w:hAnsiTheme="majorBidi" w:cstheme="majorBidi"/>
-                <w:b w:val="0"/>
-                <w:bCs w:val="0"/>
-              </w:rPr>
-              <w:t>new_center</w:t>
-            </w:r>
-            <w:proofErr w:type="spellEnd"/>
-            <w:r>
-              <w:rPr>
-                <w:rFonts w:asciiTheme="majorBidi" w:hAnsiTheme="majorBidi" w:cstheme="majorBidi"/>
-                <w:b w:val="0"/>
-                <w:bCs w:val="0"/>
-              </w:rPr>
-              <w:t xml:space="preserve"> </w:t>
-            </w:r>
-            <w:r>
-              <w:rPr>
-                <w:rFonts w:asciiTheme="majorBidi" w:hAnsiTheme="majorBidi" w:cstheme="majorBidi"/>
-                <w:b w:val="0"/>
-                <w:bCs w:val="0"/>
-              </w:rPr>
-              <w:t>←</w:t>
-            </w:r>
-            <w:r>
-              <w:rPr>
-                <w:rFonts w:asciiTheme="majorBidi" w:hAnsiTheme="majorBidi" w:cstheme="majorBidi"/>
-                <w:b w:val="0"/>
-                <w:bCs w:val="0"/>
-              </w:rPr>
-              <w:t xml:space="preserve"> </w:t>
-            </w:r>
-            <w:proofErr w:type="spellStart"/>
-            <w:r>
-              <w:rPr>
-                <w:rFonts w:asciiTheme="majorBidi" w:hAnsiTheme="majorBidi" w:cstheme="majorBidi"/>
-                <w:b w:val="0"/>
-                <w:bCs w:val="0"/>
-              </w:rPr>
-              <w:t>batch_adat</w:t>
-            </w:r>
-            <w:proofErr w:type="spellEnd"/>
-            <w:r>
-              <w:rPr>
-                <w:rFonts w:asciiTheme="majorBidi" w:hAnsiTheme="majorBidi" w:cstheme="majorBidi"/>
-                <w:b w:val="0"/>
-                <w:bCs w:val="0"/>
-              </w:rPr>
-              <w:t>[</w:t>
-            </w:r>
-            <w:proofErr w:type="spellStart"/>
-            <w:r>
-              <w:rPr>
-                <w:rFonts w:asciiTheme="majorBidi" w:hAnsiTheme="majorBidi" w:cstheme="majorBidi"/>
-                <w:b w:val="0"/>
-                <w:bCs w:val="0"/>
-              </w:rPr>
-              <w:t>idx</w:t>
-            </w:r>
-            <w:proofErr w:type="spellEnd"/>
-            <w:r>
-              <w:rPr>
-                <w:rFonts w:asciiTheme="majorBidi" w:hAnsiTheme="majorBidi" w:cstheme="majorBidi"/>
-                <w:b w:val="0"/>
-                <w:bCs w:val="0"/>
-              </w:rPr>
-              <w:t>]</w:t>
+            <w:r>
+              <w:rPr>
+                <w:rFonts w:asciiTheme="majorBidi" w:hAnsiTheme="majorBidi" w:cstheme="majorBidi"/>
+                <w:b w:val="0"/>
+                <w:bCs w:val="0"/>
+              </w:rPr>
+              <w:t>new_center ← batch_adat[idx]</w:t>
             </w:r>
           </w:p>
           <w:p>
@@ -1092,70 +533,8 @@
                 <w:b w:val="0"/>
                 <w:bCs w:val="0"/>
               </w:rPr>
-              <w:t xml:space="preserve">12                       </w:t>
-            </w:r>
-            <w:proofErr w:type="spellStart"/>
-            <w:r>
-              <w:rPr>
-                <w:rFonts w:asciiTheme="majorBidi" w:hAnsiTheme="majorBidi" w:cstheme="majorBidi"/>
-                <w:b w:val="0"/>
-                <w:bCs w:val="0"/>
-              </w:rPr>
-              <w:t>centroids</w:t>
-            </w:r>
-            <w:proofErr w:type="spellEnd"/>
-            <w:r>
-              <w:rPr>
-                <w:rFonts w:asciiTheme="majorBidi" w:hAnsiTheme="majorBidi" w:cstheme="majorBidi"/>
-                <w:b w:val="0"/>
-                <w:bCs w:val="0"/>
-              </w:rPr>
-              <w:t xml:space="preserve"> </w:t>
-            </w:r>
-            <w:r>
-              <w:rPr>
-                <w:rFonts w:asciiTheme="majorBidi" w:hAnsiTheme="majorBidi" w:cstheme="majorBidi"/>
-                <w:b w:val="0"/>
-                <w:bCs w:val="0"/>
-              </w:rPr>
-              <w:t>←</w:t>
-            </w:r>
-            <w:r>
-              <w:rPr>
-                <w:rFonts w:asciiTheme="majorBidi" w:hAnsiTheme="majorBidi" w:cstheme="majorBidi"/>
-                <w:b w:val="0"/>
-                <w:bCs w:val="0"/>
-              </w:rPr>
-              <w:t xml:space="preserve"> </w:t>
-            </w:r>
-            <w:proofErr w:type="spellStart"/>
-            <w:r>
-              <w:rPr>
-                <w:rFonts w:asciiTheme="majorBidi" w:hAnsiTheme="majorBidi" w:cstheme="majorBidi"/>
-                <w:b w:val="0"/>
-                <w:bCs w:val="0"/>
-              </w:rPr>
-              <w:t>centroids</w:t>
-            </w:r>
-            <w:proofErr w:type="spellEnd"/>
-            <w:r>
-              <w:rPr>
-                <w:rFonts w:asciiTheme="majorBidi" w:hAnsiTheme="majorBidi" w:cstheme="majorBidi"/>
-                <w:b w:val="0"/>
-                <w:bCs w:val="0"/>
-              </w:rPr>
-              <w:t xml:space="preserve"> + </w:t>
-            </w:r>
-            <w:proofErr w:type="spellStart"/>
-            <w:r>
-              <w:rPr>
-                <w:rFonts w:asciiTheme="majorBidi" w:hAnsiTheme="majorBidi" w:cstheme="majorBidi"/>
-                <w:b w:val="0"/>
-                <w:bCs w:val="0"/>
-              </w:rPr>
-              <w:t>new_center</w:t>
-            </w:r>
-            <w:proofErr w:type="spellEnd"/>
+              <w:t>12                       centroids ← centroids + new_center</w:t>
+            </w:r>
           </w:p>
           <w:p>
             <w:pPr>
@@ -1201,16 +580,8 @@
               <w:rPr>
                 <w:rFonts w:asciiTheme="majorBidi" w:hAnsiTheme="majorBidi" w:cstheme="majorBidi"/>
               </w:rPr>
-              <w:t xml:space="preserve">end </w:t>
-            </w:r>
-            <w:proofErr w:type="spellStart"/>
-            <w:r>
-              <w:rPr>
-                <w:rFonts w:asciiTheme="majorBidi" w:hAnsiTheme="majorBidi" w:cstheme="majorBidi"/>
-              </w:rPr>
-              <w:t>for</w:t>
-            </w:r>
-            <w:proofErr w:type="spellEnd"/>
+              <w:t>end for</w:t>
+            </w:r>
           </w:p>
           <w:p>
             <w:pPr>
@@ -1256,16 +627,8 @@
               <w:rPr>
                 <w:rFonts w:asciiTheme="majorBidi" w:hAnsiTheme="majorBidi" w:cstheme="majorBidi"/>
               </w:rPr>
-              <w:t xml:space="preserve">end </w:t>
-            </w:r>
-            <w:proofErr w:type="spellStart"/>
-            <w:r>
-              <w:rPr>
-                <w:rFonts w:asciiTheme="majorBidi" w:hAnsiTheme="majorBidi" w:cstheme="majorBidi"/>
-              </w:rPr>
-              <w:t>if</w:t>
-            </w:r>
-            <w:proofErr w:type="spellEnd"/>
+              <w:t>end if</w:t>
+            </w:r>
           </w:p>
           <w:p>
             <w:pPr>
@@ -1307,32 +670,46 @@
               </w:rPr>
               <w:t xml:space="preserve">      </w:t>
             </w:r>
-            <w:proofErr w:type="spellStart"/>
-            <w:r>
-              <w:rPr>
-                <w:rFonts w:asciiTheme="majorBidi" w:hAnsiTheme="majorBidi" w:cstheme="majorBidi"/>
-              </w:rPr>
-              <w:t>foreach</w:t>
-            </w:r>
-            <w:proofErr w:type="spellEnd"/>
-            <w:r>
-              <w:rPr>
-                <w:rFonts w:asciiTheme="majorBidi" w:hAnsiTheme="majorBidi" w:cstheme="majorBidi"/>
-                <w:b w:val="0"/>
-                <w:bCs w:val="0"/>
+            <w:r>
+              <w:rPr>
+                <w:rFonts w:asciiTheme="majorBidi" w:hAnsiTheme="majorBidi" w:cstheme="majorBidi"/>
+              </w:rPr>
+              <w:t>for</w:t>
+            </w:r>
+            <w:r>
+              <w:rPr>
+                <w:rFonts w:asciiTheme="majorBidi" w:hAnsiTheme="majorBidi" w:cstheme="majorBidi"/>
               </w:rPr>
               <w:t xml:space="preserve"> </w:t>
             </w:r>
-            <w:proofErr w:type="spellStart"/>
-            <w:r>
-              <w:rPr>
-                <w:rFonts w:asciiTheme="majorBidi" w:hAnsiTheme="majorBidi" w:cstheme="majorBidi"/>
-                <w:b w:val="0"/>
-                <w:bCs w:val="0"/>
-              </w:rPr>
-              <w:t>centroid</w:t>
-            </w:r>
-            <w:proofErr w:type="spellEnd"/>
+            <w:r>
+              <w:rPr>
+                <w:rFonts w:asciiTheme="majorBidi" w:hAnsiTheme="majorBidi" w:cstheme="majorBidi"/>
+              </w:rPr>
+              <w:t>each</w:t>
+            </w:r>
+            <w:r>
+              <w:rPr>
+                <w:rFonts w:asciiTheme="majorBidi" w:hAnsiTheme="majorBidi" w:cstheme="majorBidi"/>
+                <w:b w:val="0"/>
+                <w:bCs w:val="0"/>
+              </w:rPr>
+              <w:t xml:space="preserve"> centroid </w:t>
+            </w:r>
+            <w:r>
+              <w:rPr>
+                <w:rFonts w:asciiTheme="majorBidi" w:hAnsiTheme="majorBidi" w:cstheme="majorBidi"/>
+              </w:rPr>
+              <w:t>in</w:t>
+            </w:r>
+            <w:r>
+              <w:rPr>
+                <w:rFonts w:asciiTheme="majorBidi" w:hAnsiTheme="majorBidi" w:cstheme="majorBidi"/>
+                <w:b w:val="0"/>
+                <w:bCs w:val="0"/>
+              </w:rPr>
+              <w:t xml:space="preserve"> centroids</w:t>
+            </w:r>
             <w:r>
               <w:rPr>
                 <w:rFonts w:asciiTheme="majorBidi" w:hAnsiTheme="majorBidi" w:cstheme="majorBidi"/>
@@ -1345,42 +722,8 @@
               <w:rPr>
                 <w:rFonts w:asciiTheme="majorBidi" w:hAnsiTheme="majorBidi" w:cstheme="majorBidi"/>
               </w:rPr>
-              <w:t>in</w:t>
-            </w:r>
-            <w:r>
-              <w:rPr>
-                <w:rFonts w:asciiTheme="majorBidi" w:hAnsiTheme="majorBidi" w:cstheme="majorBidi"/>
-                <w:b w:val="0"/>
-                <w:bCs w:val="0"/>
-              </w:rPr>
-              <w:t xml:space="preserve"> </w:t>
-            </w:r>
-            <w:proofErr w:type="spellStart"/>
-            <w:r>
-              <w:rPr>
-                <w:rFonts w:asciiTheme="majorBidi" w:hAnsiTheme="majorBidi" w:cstheme="majorBidi"/>
-                <w:b w:val="0"/>
-                <w:bCs w:val="0"/>
-              </w:rPr>
-              <w:t>centroids</w:t>
-            </w:r>
-            <w:proofErr w:type="spellEnd"/>
-            <w:r>
-              <w:rPr>
-                <w:rFonts w:asciiTheme="majorBidi" w:hAnsiTheme="majorBidi" w:cstheme="majorBidi"/>
-                <w:b w:val="0"/>
-                <w:bCs w:val="0"/>
-              </w:rPr>
-              <w:t xml:space="preserve"> </w:t>
-            </w:r>
-            <w:proofErr w:type="spellStart"/>
-            <w:r>
-              <w:rPr>
-                <w:rFonts w:asciiTheme="majorBidi" w:hAnsiTheme="majorBidi" w:cstheme="majorBidi"/>
-              </w:rPr>
               <w:t>do</w:t>
             </w:r>
-            <w:proofErr w:type="spellEnd"/>
           </w:p>
           <w:p>
             <w:pPr>
@@ -1420,18 +763,14 @@
                 <w:b w:val="0"/>
                 <w:bCs w:val="0"/>
               </w:rPr>
-              <w:t xml:space="preserve">              </w:t>
-            </w:r>
-            <w:proofErr w:type="spellStart"/>
-            <w:r>
-              <w:rPr>
-                <w:rFonts w:asciiTheme="majorBidi" w:hAnsiTheme="majorBidi" w:cstheme="majorBidi"/>
-                <w:b w:val="0"/>
-                <w:bCs w:val="0"/>
-              </w:rPr>
-              <w:t>centroid</w:t>
-            </w:r>
-            <w:proofErr w:type="spellEnd"/>
+              <w:t xml:space="preserve">              centroid ← </w:t>
+            </w:r>
+            <w:r>
+              <w:rPr>
+                <w:rFonts w:asciiTheme="majorBidi" w:hAnsiTheme="majorBidi" w:cstheme="majorBidi"/>
+              </w:rPr>
+              <w:t>function</w:t>
+            </w:r>
             <w:r>
               <w:rPr>
                 <w:rFonts w:asciiTheme="majorBidi" w:hAnsiTheme="majorBidi" w:cstheme="majorBidi"/>
@@ -1446,67 +785,15 @@
                 <w:b w:val="0"/>
                 <w:bCs w:val="0"/>
               </w:rPr>
-              <w:t>←</w:t>
-            </w:r>
-            <w:r>
-              <w:rPr>
-                <w:rFonts w:asciiTheme="majorBidi" w:hAnsiTheme="majorBidi" w:cstheme="majorBidi"/>
-                <w:b w:val="0"/>
-                <w:bCs w:val="0"/>
-              </w:rPr>
-              <w:t xml:space="preserve"> </w:t>
-            </w:r>
-            <w:proofErr w:type="spellStart"/>
-            <w:r>
-              <w:rPr>
-                <w:rFonts w:asciiTheme="majorBidi" w:hAnsiTheme="majorBidi" w:cstheme="majorBidi"/>
-              </w:rPr>
-              <w:t>function</w:t>
-            </w:r>
-            <w:proofErr w:type="spellEnd"/>
-            <w:r>
-              <w:rPr>
-                <w:rFonts w:asciiTheme="majorBidi" w:hAnsiTheme="majorBidi" w:cstheme="majorBidi"/>
-                <w:b w:val="0"/>
-                <w:bCs w:val="0"/>
-              </w:rPr>
-              <w:t xml:space="preserve"> </w:t>
-            </w:r>
-            <w:proofErr w:type="spellStart"/>
-            <w:r>
-              <w:rPr>
-                <w:rFonts w:asciiTheme="majorBidi" w:hAnsiTheme="majorBidi" w:cstheme="majorBidi"/>
-                <w:b w:val="0"/>
-                <w:bCs w:val="0"/>
-              </w:rPr>
-              <w:t>update_</w:t>
-            </w:r>
-            <w:proofErr w:type="gramStart"/>
-            <w:r>
-              <w:rPr>
-                <w:rFonts w:asciiTheme="majorBidi" w:hAnsiTheme="majorBidi" w:cstheme="majorBidi"/>
-                <w:b w:val="0"/>
-                <w:bCs w:val="0"/>
-              </w:rPr>
-              <w:t>stats</w:t>
-            </w:r>
-            <w:proofErr w:type="spellEnd"/>
-            <w:r>
-              <w:rPr>
-                <w:rFonts w:asciiTheme="majorBidi" w:hAnsiTheme="majorBidi" w:cstheme="majorBidi"/>
-                <w:b w:val="0"/>
-                <w:bCs w:val="0"/>
-              </w:rPr>
-              <w:t>(</w:t>
-            </w:r>
-            <w:proofErr w:type="gramEnd"/>
-            <w:r>
-              <w:rPr>
-                <w:rFonts w:asciiTheme="majorBidi" w:hAnsiTheme="majorBidi" w:cstheme="majorBidi"/>
-                <w:b w:val="0"/>
-                <w:bCs w:val="0"/>
-              </w:rPr>
-              <w:t>)</w:t>
+              <w:t>_</w:t>
+            </w:r>
+            <w:r>
+              <w:rPr>
+                <w:rFonts w:asciiTheme="majorBidi" w:hAnsiTheme="majorBidi" w:cstheme="majorBidi"/>
+                <w:b w:val="0"/>
+                <w:bCs w:val="0"/>
+              </w:rPr>
+              <w:t>update_stats()</w:t>
             </w:r>
           </w:p>
           <w:p>
@@ -1553,19 +840,12 @@
               <w:rPr>
                 <w:rFonts w:asciiTheme="majorBidi" w:hAnsiTheme="majorBidi" w:cstheme="majorBidi"/>
               </w:rPr>
-              <w:t xml:space="preserve">end </w:t>
-            </w:r>
-            <w:proofErr w:type="spellStart"/>
-            <w:r>
-              <w:rPr>
-                <w:rFonts w:asciiTheme="majorBidi" w:hAnsiTheme="majorBidi" w:cstheme="majorBidi"/>
-              </w:rPr>
-              <w:t>for</w:t>
-            </w:r>
-            <w:proofErr w:type="spellEnd"/>
+              <w:t>end for</w:t>
+            </w:r>
           </w:p>
           <w:p>
             <w:pPr>
+              <w:spacing w:after="120"/>
               <w:rPr>
                 <w:rFonts w:asciiTheme="majorBidi" w:hAnsiTheme="majorBidi" w:cstheme="majorBidi"/>
                 <w:b w:val="0"/>
@@ -1604,57 +884,19 @@
               </w:rPr>
               <w:t xml:space="preserve">      </w:t>
             </w:r>
-            <w:proofErr w:type="spellStart"/>
             <w:r>
               <w:rPr>
                 <w:rFonts w:asciiTheme="majorBidi" w:hAnsiTheme="majorBidi" w:cstheme="majorBidi"/>
               </w:rPr>
               <w:t>function</w:t>
             </w:r>
-            <w:proofErr w:type="spellEnd"/>
-            <w:r>
-              <w:rPr>
-                <w:rFonts w:asciiTheme="majorBidi" w:hAnsiTheme="majorBidi" w:cstheme="majorBidi"/>
-                <w:b w:val="0"/>
-                <w:bCs w:val="0"/>
-              </w:rPr>
-              <w:t xml:space="preserve"> _</w:t>
-            </w:r>
-            <w:proofErr w:type="spellStart"/>
-            <w:r>
-              <w:rPr>
-                <w:rFonts w:asciiTheme="majorBidi" w:hAnsiTheme="majorBidi" w:cstheme="majorBidi"/>
-                <w:b w:val="0"/>
-                <w:bCs w:val="0"/>
-              </w:rPr>
-              <w:t>merge_close_</w:t>
-            </w:r>
-            <w:proofErr w:type="gramStart"/>
-            <w:r>
-              <w:rPr>
-                <w:rFonts w:asciiTheme="majorBidi" w:hAnsiTheme="majorBidi" w:cstheme="majorBidi"/>
-                <w:b w:val="0"/>
-                <w:bCs w:val="0"/>
-              </w:rPr>
-              <w:t>cluster</w:t>
-            </w:r>
-            <w:proofErr w:type="spellEnd"/>
-            <w:r>
-              <w:rPr>
-                <w:rFonts w:asciiTheme="majorBidi" w:hAnsiTheme="majorBidi" w:cstheme="majorBidi"/>
-                <w:b w:val="0"/>
-                <w:bCs w:val="0"/>
-              </w:rPr>
-              <w:t>(</w:t>
-            </w:r>
-            <w:proofErr w:type="gramEnd"/>
-            <w:r>
-              <w:rPr>
-                <w:rFonts w:asciiTheme="majorBidi" w:hAnsiTheme="majorBidi" w:cstheme="majorBidi"/>
-                <w:b w:val="0"/>
-                <w:bCs w:val="0"/>
-              </w:rPr>
-              <w:t>)</w:t>
+            <w:r>
+              <w:rPr>
+                <w:rFonts w:asciiTheme="majorBidi" w:hAnsiTheme="majorBidi" w:cstheme="majorBidi"/>
+                <w:b w:val="0"/>
+                <w:bCs w:val="0"/>
+              </w:rPr>
+              <w:t xml:space="preserve"> _merge_close_cluster()</w:t>
             </w:r>
           </w:p>
         </w:tc>
@@ -1735,21 +977,7 @@
         <w:rPr>
           <w:lang w:eastAsia="en-US"/>
         </w:rPr>
-        <w:t xml:space="preserve">1. </w:t>
-      </w:r>
-      <w:proofErr w:type="spellStart"/>
-      <w:r>
-        <w:rPr>
-          <w:lang w:eastAsia="en-US"/>
-        </w:rPr>
-        <w:t>KMeans</w:t>
-      </w:r>
-      <w:proofErr w:type="spellEnd"/>
-      <w:r>
-        <w:rPr>
-          <w:lang w:eastAsia="en-US"/>
-        </w:rPr>
-        <w:t>++ inicializálás</w:t>
+        <w:t>1. KMeans++ inicializálás</w:t>
       </w:r>
     </w:p>
     <w:p>
@@ -1763,21 +991,7 @@
         <w:rPr>
           <w:lang w:eastAsia="en-US"/>
         </w:rPr>
-        <w:t xml:space="preserve">2. FOR </w:t>
-      </w:r>
-      <w:proofErr w:type="spellStart"/>
-      <w:r>
-        <w:rPr>
-          <w:lang w:eastAsia="en-US"/>
-        </w:rPr>
-        <w:t>x_adat</w:t>
-      </w:r>
-      <w:proofErr w:type="spellEnd"/>
-      <w:r>
-        <w:rPr>
-          <w:lang w:eastAsia="en-US"/>
-        </w:rPr>
-        <w:t xml:space="preserve"> IN batch:</w:t>
+        <w:t>2. FOR x_adat IN batch:</w:t>
       </w:r>
     </w:p>
     <w:p>
@@ -1792,79 +1006,8 @@
           <w:lang w:eastAsia="en-US"/>
         </w:rPr>
         <w:tab/>
-      </w:r>
-      <w:proofErr w:type="spellStart"/>
-      <w:r>
-        <w:rPr>
-          <w:lang w:eastAsia="en-US"/>
-        </w:rPr>
-        <w:t>distance_adat</w:t>
-      </w:r>
-      <w:proofErr w:type="spellEnd"/>
-      <w:r>
-        <w:rPr>
-          <w:lang w:eastAsia="en-US"/>
-        </w:rPr>
-        <w:t xml:space="preserve"> = </w:t>
-      </w:r>
-      <w:proofErr w:type="gramStart"/>
-      <w:r>
-        <w:rPr>
-          <w:lang w:eastAsia="en-US"/>
-        </w:rPr>
-        <w:t>min(</w:t>
-      </w:r>
-      <w:proofErr w:type="spellStart"/>
-      <w:proofErr w:type="gramEnd"/>
-      <w:r>
-        <w:rPr>
-          <w:lang w:eastAsia="en-US"/>
-        </w:rPr>
-        <w:t>distance</w:t>
-      </w:r>
-      <w:proofErr w:type="spellEnd"/>
-      <w:r>
-        <w:rPr>
-          <w:lang w:eastAsia="en-US"/>
-        </w:rPr>
-        <w:t>(</w:t>
-      </w:r>
-      <w:proofErr w:type="spellStart"/>
-      <w:r>
-        <w:rPr>
-          <w:lang w:eastAsia="en-US"/>
-        </w:rPr>
-        <w:t>x_adat</w:t>
-      </w:r>
-      <w:proofErr w:type="spellEnd"/>
-      <w:r>
-        <w:rPr>
-          <w:lang w:eastAsia="en-US"/>
-        </w:rPr>
-        <w:t xml:space="preserve">, </w:t>
-      </w:r>
-      <w:proofErr w:type="spellStart"/>
-      <w:r>
-        <w:rPr>
-          <w:lang w:eastAsia="en-US"/>
-        </w:rPr>
-        <w:t>centroid</w:t>
-      </w:r>
-      <w:proofErr w:type="spellEnd"/>
-      <w:r>
-        <w:rPr>
-          <w:lang w:eastAsia="en-US"/>
-        </w:rPr>
-        <w:t xml:space="preserve">)) minden </w:t>
-      </w:r>
-      <w:proofErr w:type="spellStart"/>
-      <w:r>
-        <w:rPr>
-          <w:lang w:eastAsia="en-US"/>
-        </w:rPr>
-        <w:t>centroidra</w:t>
-      </w:r>
-      <w:proofErr w:type="spellEnd"/>
+        <w:t>distance_adat = min(distance(x_adat, centroid)) minden centroidra</w:t>
+      </w:r>
     </w:p>
     <w:p>
       <w:pPr>
@@ -1878,35 +1021,7 @@
           <w:lang w:eastAsia="en-US"/>
         </w:rPr>
         <w:tab/>
-        <w:t xml:space="preserve">IF </w:t>
-      </w:r>
-      <w:proofErr w:type="spellStart"/>
-      <w:r>
-        <w:rPr>
-          <w:lang w:eastAsia="en-US"/>
-        </w:rPr>
-        <w:t>distance_adat</w:t>
-      </w:r>
-      <w:proofErr w:type="spellEnd"/>
-      <w:r>
-        <w:rPr>
-          <w:lang w:eastAsia="en-US"/>
-        </w:rPr>
-        <w:t xml:space="preserve"> &gt; </w:t>
-      </w:r>
-      <w:proofErr w:type="spellStart"/>
-      <w:r>
-        <w:rPr>
-          <w:lang w:eastAsia="en-US"/>
-        </w:rPr>
-        <w:t>new_cluster_threshold</w:t>
-      </w:r>
-      <w:proofErr w:type="spellEnd"/>
-      <w:r>
-        <w:rPr>
-          <w:lang w:eastAsia="en-US"/>
-        </w:rPr>
-        <w:t>:</w:t>
+        <w:t>IF distance_adat &gt; new_cluster_threshold:</w:t>
       </w:r>
     </w:p>
     <w:p>
@@ -1927,20 +1042,7 @@
           <w:lang w:eastAsia="en-US"/>
         </w:rPr>
         <w:tab/>
-      </w:r>
-      <w:proofErr w:type="spellStart"/>
-      <w:r>
-        <w:rPr>
-          <w:lang w:eastAsia="en-US"/>
-        </w:rPr>
-        <w:t>x_adat</w:t>
-      </w:r>
-      <w:proofErr w:type="spellEnd"/>
-      <w:r>
-        <w:rPr>
-          <w:lang w:eastAsia="en-US"/>
-        </w:rPr>
-        <w:t xml:space="preserve"> új klaszterbe kerül</w:t>
+        <w:t>x_adat új klaszterbe kerül</w:t>
       </w:r>
     </w:p>
     <w:p>
@@ -1976,20 +1078,7 @@
           <w:lang w:eastAsia="en-US"/>
         </w:rPr>
         <w:tab/>
-      </w:r>
-      <w:proofErr w:type="spellStart"/>
-      <w:r>
-        <w:rPr>
-          <w:lang w:eastAsia="en-US"/>
-        </w:rPr>
-        <w:t>x_adat</w:t>
-      </w:r>
-      <w:proofErr w:type="spellEnd"/>
-      <w:r>
-        <w:rPr>
-          <w:lang w:eastAsia="en-US"/>
-        </w:rPr>
-        <w:t xml:space="preserve"> a legközelebbi klaszterbe</w:t>
+        <w:t>x_adat a legközelebbi klaszterbe</w:t>
       </w:r>
     </w:p>
     <w:p>
@@ -2003,21 +1092,7 @@
         <w:rPr>
           <w:lang w:eastAsia="en-US"/>
         </w:rPr>
-        <w:t xml:space="preserve">3. FOR minden </w:t>
-      </w:r>
-      <w:proofErr w:type="spellStart"/>
-      <w:r>
-        <w:rPr>
-          <w:lang w:eastAsia="en-US"/>
-        </w:rPr>
-        <w:t>centroidra</w:t>
-      </w:r>
-      <w:proofErr w:type="spellEnd"/>
-      <w:r>
-        <w:rPr>
-          <w:lang w:eastAsia="en-US"/>
-        </w:rPr>
-        <w:t>:</w:t>
+        <w:t>3. FOR minden centroidra:</w:t>
       </w:r>
     </w:p>
     <w:p>
@@ -2034,12 +1109,6 @@
           <w:lang w:eastAsia="en-US"/>
         </w:rPr>
         <w:tab/>
-      </w:r>
-      <w:proofErr w:type="spellStart"/>
-      <w:r>
-        <w:rPr>
-          <w:lang w:eastAsia="en-US"/>
-        </w:rPr>
         <w:t>centroid</w:t>
       </w:r>
       <w:r>
@@ -2049,7 +1118,6 @@
         </w:rPr>
         <w:t>i</w:t>
       </w:r>
-      <w:proofErr w:type="spellEnd"/>
       <w:r>
         <w:rPr>
           <w:vertAlign w:val="subscript"/>
@@ -2098,16 +1166,8 @@
         <w:rPr>
           <w:lang w:eastAsia="en-US"/>
         </w:rPr>
-        <w:t xml:space="preserve">4. FOR c IN </w:t>
-      </w:r>
-      <w:proofErr w:type="spellStart"/>
-      <w:r>
-        <w:rPr>
-          <w:lang w:eastAsia="en-US"/>
-        </w:rPr>
-        <w:t>centroids</w:t>
-      </w:r>
-      <w:proofErr w:type="spellEnd"/>
+        <w:t>4. FOR c IN centroids</w:t>
+      </w:r>
     </w:p>
     <w:p>
       <w:pPr>
@@ -2121,16 +1181,8 @@
           <w:lang w:eastAsia="en-US"/>
         </w:rPr>
         <w:tab/>
-        <w:t xml:space="preserve">FOR c’ IN </w:t>
-      </w:r>
-      <w:proofErr w:type="spellStart"/>
-      <w:r>
-        <w:rPr>
-          <w:lang w:eastAsia="en-US"/>
-        </w:rPr>
-        <w:t>centroids</w:t>
-      </w:r>
-      <w:proofErr w:type="spellEnd"/>
+        <w:t>FOR c’ IN centroids</w:t>
+      </w:r>
     </w:p>
     <w:p>
       <w:pPr>
@@ -2150,43 +1202,7 @@
           <w:lang w:eastAsia="en-US"/>
         </w:rPr>
         <w:tab/>
-        <w:t xml:space="preserve">IF </w:t>
-      </w:r>
-      <w:proofErr w:type="spellStart"/>
-      <w:proofErr w:type="gramStart"/>
-      <w:r>
-        <w:rPr>
-          <w:lang w:eastAsia="en-US"/>
-        </w:rPr>
-        <w:t>distance</w:t>
-      </w:r>
-      <w:proofErr w:type="spellEnd"/>
-      <w:r>
-        <w:rPr>
-          <w:lang w:eastAsia="en-US"/>
-        </w:rPr>
-        <w:t>(</w:t>
-      </w:r>
-      <w:proofErr w:type="gramEnd"/>
-      <w:r>
-        <w:rPr>
-          <w:lang w:eastAsia="en-US"/>
-        </w:rPr>
-        <w:t xml:space="preserve">c, c’) &lt; </w:t>
-      </w:r>
-      <w:proofErr w:type="spellStart"/>
-      <w:r>
-        <w:rPr>
-          <w:lang w:eastAsia="en-US"/>
-        </w:rPr>
-        <w:t>merge_threshold</w:t>
-      </w:r>
-      <w:proofErr w:type="spellEnd"/>
-      <w:r>
-        <w:rPr>
-          <w:lang w:eastAsia="en-US"/>
-        </w:rPr>
-        <w:t>:</w:t>
+        <w:t>IF distance(c, c’) &lt; merge_threshold:</w:t>
       </w:r>
     </w:p>
     <w:p>
@@ -2228,21 +1244,7 @@
         <w:rPr>
           <w:lang w:eastAsia="en-US"/>
         </w:rPr>
-        <w:t>c-</w:t>
-      </w:r>
-      <w:proofErr w:type="spellStart"/>
-      <w:r>
-        <w:rPr>
-          <w:lang w:eastAsia="en-US"/>
-        </w:rPr>
-        <w:t>hez</w:t>
-      </w:r>
-      <w:proofErr w:type="spellEnd"/>
-      <w:r>
-        <w:rPr>
-          <w:lang w:eastAsia="en-US"/>
-        </w:rPr>
-        <w:t xml:space="preserve"> tartozó pontok számának, koordinátáinak összegének és klaszter szórásának frissítése</w:t>
+        <w:t>c-hez tartozó pontok számának, koordinátáinak összegének és klaszter szórásának frissítése</w:t>
       </w:r>
     </w:p>
     <w:p>
@@ -2359,21 +1361,7 @@
         <w:rPr>
           <w:lang w:eastAsia="en-US"/>
         </w:rPr>
-        <w:t xml:space="preserve">Az </w:t>
-      </w:r>
-      <w:proofErr w:type="spellStart"/>
-      <w:r>
-        <w:rPr>
-          <w:lang w:eastAsia="en-US"/>
-        </w:rPr>
-        <w:t>embedding</w:t>
-      </w:r>
-      <w:proofErr w:type="spellEnd"/>
-      <w:r>
-        <w:rPr>
-          <w:lang w:eastAsia="en-US"/>
-        </w:rPr>
-        <w:t xml:space="preserve"> tömbök és a nyers adatfájlok azonban nem található</w:t>
+        <w:t>Az embedding tömbök és a nyers adatfájlok azonban nem található</w:t>
       </w:r>
       <w:r>
         <w:rPr>
@@ -2385,21 +1373,7 @@
         <w:rPr>
           <w:lang w:eastAsia="en-US"/>
         </w:rPr>
-        <w:t xml:space="preserve">k meg a </w:t>
-      </w:r>
-      <w:proofErr w:type="spellStart"/>
-      <w:r>
-        <w:rPr>
-          <w:lang w:eastAsia="en-US"/>
-        </w:rPr>
-        <w:t>repozitóriumban</w:t>
-      </w:r>
-      <w:proofErr w:type="spellEnd"/>
-      <w:r>
-        <w:rPr>
-          <w:lang w:eastAsia="en-US"/>
-        </w:rPr>
-        <w:t>, mivel méretük meghaladta a GitHub által engedélyezett korlátot.</w:t>
+        <w:t>k meg a repozitóriumban, mivel méretük meghaladta a GitHub által engedélyezett korlátot.</w:t>
       </w:r>
     </w:p>
     <w:p/>
@@ -3015,6 +1989,7 @@
   <w:style w:type="character" w:default="1" w:styleId="Bekezdsalapbettpusa">
     <w:name w:val="Default Paragraph Font"/>
     <w:uiPriority w:val="1"/>
+    <w:semiHidden/>
     <w:unhideWhenUsed/>
   </w:style>
   <w:style w:type="table" w:default="1" w:styleId="Normltblzat">

</xml_diff>